<commit_message>
Add the scrolling news band, and fix the footer logo
</commit_message>
<xml_diff>
--- a/Hand over documentation/amrut-back-office-handover.docx
+++ b/Hand over documentation/amrut-back-office-handover.docx
@@ -1165,26 +1165,26 @@
           <w:sz w:val="23"/>
           <w:szCs w:val="23"/>
         </w:rPr>
-        <w:t xml:space="preserve">3.6 वापरकर्ते · People   (head office only)</w:t>
-      </w:r>
-    </w:p>
-    <w:p>
-      <w:pPr>
-        <w:spacing w:after="100" w:line="264"/>
-        <w:ind w:left="360"/>
-      </w:pPr>
-      <w:r>
-        <w:rPr>
-          <w:rFonts w:ascii="Calibri" w:cs="Calibri" w:eastAsia="Calibri" w:hAnsi="Calibri"/>
-          <w:b w:val="false"/>
-          <w:bCs w:val="false"/>
-          <w:i w:val="false"/>
-          <w:iCs w:val="false"/>
-          <w:color w:val="1A1613"/>
-          <w:sz w:val="21"/>
-          <w:szCs w:val="21"/>
-        </w:rPr>
-        <w:t xml:space="preserve">Every account, its level and its district or division. Read-only today.</w:t>
+        <w:t xml:space="preserve">3.6 बातमीपट्टी · Ticker   (head office only)</w:t>
+      </w:r>
+    </w:p>
+    <w:p>
+      <w:pPr>
+        <w:spacing w:after="100" w:line="264"/>
+        <w:ind w:left="360"/>
+      </w:pPr>
+      <w:r>
+        <w:rPr>
+          <w:rFonts w:ascii="Calibri" w:cs="Calibri" w:eastAsia="Calibri" w:hAnsi="Calibri"/>
+          <w:b w:val="false"/>
+          <w:bCs w:val="false"/>
+          <w:i w:val="false"/>
+          <w:iCs w:val="false"/>
+          <w:color w:val="1A1613"/>
+          <w:sz w:val="21"/>
+          <w:szCs w:val="21"/>
+        </w:rPr>
+        <w:t xml:space="preserve">The band of six scrolling lines under the portal's navigation. The screen shows the band exactly as the portal draws it, then the six lines below. One line is edited at a time — its words, its link, and whether it is shown. Drag a line to change its place in the order, or use the arrows beside it. A link must be a path inside the portal (/govet-schemes) or a full web address; anything else is refused. The portal picks a change up immediately — no rebuild, no deploy.</w:t>
       </w:r>
     </w:p>
     <w:p>
@@ -1201,7 +1201,43 @@
           <w:sz w:val="23"/>
           <w:szCs w:val="23"/>
         </w:rPr>
-        <w:t xml:space="preserve">3.7 माझे खाते · Account</w:t>
+        <w:t xml:space="preserve">3.7 वापरकर्ते · People   (head office only)</w:t>
+      </w:r>
+    </w:p>
+    <w:p>
+      <w:pPr>
+        <w:spacing w:after="100" w:line="264"/>
+        <w:ind w:left="360"/>
+      </w:pPr>
+      <w:r>
+        <w:rPr>
+          <w:rFonts w:ascii="Calibri" w:cs="Calibri" w:eastAsia="Calibri" w:hAnsi="Calibri"/>
+          <w:b w:val="false"/>
+          <w:bCs w:val="false"/>
+          <w:i w:val="false"/>
+          <w:iCs w:val="false"/>
+          <w:color w:val="1A1613"/>
+          <w:sz w:val="21"/>
+          <w:szCs w:val="21"/>
+        </w:rPr>
+        <w:t xml:space="preserve">Every account, its level and its district or division. Read-only today.</w:t>
+      </w:r>
+    </w:p>
+    <w:p>
+      <w:pPr>
+        <w:keepNext/>
+        <w:spacing w:after="70" w:before="260"/>
+      </w:pPr>
+      <w:r>
+        <w:rPr>
+          <w:rFonts w:ascii="Georgia" w:cs="Georgia" w:eastAsia="Georgia" w:hAnsi="Georgia"/>
+          <w:b/>
+          <w:bCs/>
+          <w:color w:val="B45309"/>
+          <w:sz w:val="23"/>
+          <w:szCs w:val="23"/>
+        </w:rPr>
+        <w:t xml:space="preserve">3.8 माझे खाते · Account</w:t>
       </w:r>
     </w:p>
     <w:p>
@@ -2397,6 +2433,32 @@
           <w:sz w:val="21"/>
           <w:szCs w:val="21"/>
         </w:rPr>
+        <w:t xml:space="preserve">GET</w:t>
+      </w:r>
+      <w:r>
+        <w:rPr>
+          <w:rFonts w:ascii="Calibri" w:cs="Calibri" w:eastAsia="Calibri" w:hAnsi="Calibri"/>
+          <w:b w:val="false"/>
+          <w:bCs w:val="false"/>
+          <w:i w:val="false"/>
+          <w:iCs w:val="false"/>
+          <w:color w:val="1A1613"/>
+          <w:sz w:val="21"/>
+          <w:szCs w:val="21"/>
+        </w:rPr>
+        <w:t xml:space="preserve"> /api/ticker                   the six scrolling lines, in order </w:t>
+      </w:r>
+      <w:r>
+        <w:rPr>
+          <w:rFonts w:ascii="Calibri" w:cs="Calibri" w:eastAsia="Calibri" w:hAnsi="Calibri"/>
+          <w:b/>
+          <w:bCs/>
+          <w:i w:val="false"/>
+          <w:iCs w:val="false"/>
+          <w:color w:val="1A1613"/>
+          <w:sz w:val="21"/>
+          <w:szCs w:val="21"/>
+        </w:rPr>
         <w:t xml:space="preserve">POST</w:t>
       </w:r>
       <w:r>
@@ -2934,7 +2996,7 @@
           <w:sz w:val="21"/>
           <w:szCs w:val="21"/>
         </w:rPr>
-        <w:t xml:space="preserve">.md           a shorter version of this document src/ core/             the plumbing, shared by everything config.js         reads .env; the only file that knows where things are db.js             PostgreSQL or the file database, behind one interface auth.js           passwords, the sign-in cookie, form protection ids.js            the unguessable addresses http.js           sending a reply, reading a form, the audit record upload.js         reading a form that carries photographs images.js         the 400/800/1400 WebP copies visitor.js        counting a reader without identifying them shared/ layout.js         the header, navigation and page shell table.js          sortable headings, paging modules/            one folder per part of the office office/           signing in, home screen, account editorial/        stories: writing, review, publishing, photographs people/           the accounts that may use the office advertising/      placements, rate card, advertisements, payments analytics/        what is read, by whom, and what it earned publicapi/        the open read path at /api app.js            works out who is asking, hands over to the right module server.js         starts it public/office.css one stylesheet, no frameworks db/ schema.*.sql      the tables, one file per database engine migrations/       every change since, applied in order and recorded setup.js          creates the tables seed.js           divisions, districts, sections, first accounts seed-ads.js       advertising placements and rates seed-legacy.js    names of the archive stories seed-demo-*.js    sample figures and sample stories, for demonstrations make-images.js    makes the responsive copies for older photographs export-public.js  writes published stories out as files migrate.js        applies anything new in migrations/ local-postgres.js the development database on a laptop test/smoke.js       one end-to-end check of the whole thing data/               the local database, uploads, logs — never committed</w:t>
+        <w:t xml:space="preserve">.md           a shorter version of this document src/ core/             the plumbing, shared by everything config.js         reads .env; the only file that knows where things are db.js             PostgreSQL or the file database, behind one interface auth.js           passwords, the sign-in cookie, form protection ids.js            the unguessable addresses http.js           sending a reply, reading a form, the audit record upload.js         reading a form that carries photographs images.js         the 400/800/1400 WebP copies visitor.js        counting a reader without identifying them shared/ layout.js         the header, navigation and page shell table.js          sortable headings, paging modules/            one folder per part of the office office/           signing in, home screen, account editorial/        stories: writing, review, publishing, photographs people/           the accounts that may use the office advertising/      placements, rate card, advertisements, payments analytics/        what is read, by whom, and what it earned ticker/           the six scrolling lines under the navigation publicapi/        the open read path at /api app.js            works out who is asking, hands over to the right module server.js         starts it public/office.css one stylesheet, no frameworks db/ schema.*.sql      the tables, one file per database engine migrations/       every change since, applied in order and recorded setup.js          creates the tables seed.js           divisions, districts, sections, first accounts seed-ads.js       advertising placements and rates seed-legacy.js    names of the archive stories seed-demo-*.js    sample figures and sample stories, for demonstrations make-images.js    makes the responsive copies for older photographs export-public.js  writes published stories out as files migrate.js        applies anything new in migrations/ local-postgres.js the development database on a laptop test/smoke.js       one end-to-end check of the whole thing data/               the local database, uploads, logs — never committed</w:t>
       </w:r>
     </w:p>
     <w:p>
@@ -3251,7 +3313,7 @@
           <w:sz w:val="21"/>
           <w:szCs w:val="21"/>
         </w:rPr>
-        <w:t xml:space="preserve">45 checks over real </w:t>
+        <w:t xml:space="preserve">54 checks over real </w:t>
       </w:r>
       <w:r>
         <w:rPr>

</xml_diff>